<commit_message>
feat: add etic code
</commit_message>
<xml_diff>
--- a/Entrega1/Entrega1 APO3_Final_Actualizado.docx
+++ b/Entrega1/Entrega1 APO3_Final_Actualizado.docx
@@ -4708,6 +4708,132 @@
         </w:rPr>
       </w:r>
     </w:p>
+    <w:p>
+      <w:pPr>
+        <w:pBdr>
+          <w:top w:color="auto" w:space="0" w:sz="0" w:val="none"/>
+          <w:bottom w:color="auto" w:space="0" w:sz="0" w:val="none"/>
+          <w:right w:color="auto" w:space="0" w:sz="0" w:val="none"/>
+          <w:between w:color="auto" w:space="0" w:sz="0" w:val="none"/>
+        </w:pBdr>
+        <w:spacing w:after="600" w:lineRule="auto"/>
+        <w:ind w:left="0" w:firstLine="0"/>
+        <w:rPr>
+          <w:rFonts w:ascii="Times New Roman" w:cs="Times New Roman" w:eastAsia="Times New Roman" w:hAnsi="Times New Roman"/>
+          <w:b w:val="1"/>
+          <w:sz w:val="24"/>
+          <w:szCs w:val="24"/>
+        </w:rPr>
+      </w:pPr>
+      <w:r>
+        <w:rPr>
+          <w:rFonts w:ascii="Times New Roman" w:cs="Times New Roman" w:eastAsia="Times New Roman" w:hAnsi="Times New Roman"/>
+          <w:b w:val="1"/>
+          <w:sz w:val="24"/>
+          <w:szCs w:val="24"/>
+          <w:rtl w:val="0"/>
+        </w:rPr>
+        <w:t xml:space="preserve">Análisis ético</w:t>
+      </w:r>
+    </w:p>
+    <w:p>
+      <w:pPr>
+        <w:pBdr>
+          <w:top w:color="auto" w:space="0" w:sz="0" w:val="none"/>
+          <w:bottom w:color="auto" w:space="0" w:sz="0" w:val="none"/>
+          <w:right w:color="auto" w:space="0" w:sz="0" w:val="none"/>
+          <w:between w:color="auto" w:space="0" w:sz="0" w:val="none"/>
+        </w:pBdr>
+        <w:spacing w:after="240" w:lineRule="auto"/>
+        <w:rPr>
+          <w:rFonts w:ascii="Times New Roman" w:cs="Times New Roman" w:eastAsia="Times New Roman" w:hAnsi="Times New Roman"/>
+          <w:sz w:val="24"/>
+          <w:szCs w:val="24"/>
+        </w:rPr>
+      </w:pPr>
+      <w:r>
+        <w:rPr>
+          <w:rFonts w:ascii="Times New Roman" w:cs="Times New Roman" w:eastAsia="Times New Roman" w:hAnsi="Times New Roman"/>
+          <w:sz w:val="24"/>
+          <w:szCs w:val="24"/>
+          <w:rtl w:val="0"/>
+        </w:rPr>
+        <w:t xml:space="preserve">El primer eje ético es la privacidad. La captura de video y el seguimiento de articulaciones constituyen tratamiento de información potencialmente sensible. Por ello, el proyecto debe limitar el uso de los datos al objetivo declarado, minimizar la recolección (sólo lo necesario para entrenar y evaluar) y aplicar técnicas de anonimización o seudonimización cuando sea posible (por ejemplo, almacenar y procesar preferentemente coordenadas de landmarks en lugar de imágenes crudas cuando la experimentación lo permita). Además, corresponde implementar controles de acceso, cifrado en repositorio y políticas claras de retención y eliminación de datos una vez cumplido el propósito académico.</w:t>
+      </w:r>
+    </w:p>
+    <w:p>
+      <w:pPr>
+        <w:pBdr>
+          <w:top w:color="auto" w:space="0" w:sz="0" w:val="none"/>
+          <w:bottom w:color="auto" w:space="0" w:sz="0" w:val="none"/>
+          <w:right w:color="auto" w:space="0" w:sz="0" w:val="none"/>
+          <w:between w:color="auto" w:space="0" w:sz="0" w:val="none"/>
+        </w:pBdr>
+        <w:spacing w:after="240" w:before="240" w:lineRule="auto"/>
+        <w:rPr>
+          <w:rFonts w:ascii="Times New Roman" w:cs="Times New Roman" w:eastAsia="Times New Roman" w:hAnsi="Times New Roman"/>
+          <w:sz w:val="24"/>
+          <w:szCs w:val="24"/>
+        </w:rPr>
+      </w:pPr>
+      <w:r>
+        <w:rPr>
+          <w:rFonts w:ascii="Times New Roman" w:cs="Times New Roman" w:eastAsia="Times New Roman" w:hAnsi="Times New Roman"/>
+          <w:sz w:val="24"/>
+          <w:szCs w:val="24"/>
+          <w:rtl w:val="0"/>
+        </w:rPr>
+        <w:t xml:space="preserve">Un segundo pilar es el consentimiento informado y la transparencia. Antes de grabar a cualquier persona, debemos explicar con lenguaje claro qué se va a hacer, qué riesgos y beneficios existen, durante cuánto tiempo se guardarán los datos, quién tendrá acceso y con qué fines se usarán (incluida la publicación de resultados o demostraciones). La transparencia también aplica al comportamiento del sistema: se debe comunicar que las salidas del modelo son estimaciones probabilísticas y que pueden contener errores, evitando su uso para emitir juicios concluyentes sobre conducta o desempeño sin validación adicional.</w:t>
+      </w:r>
+    </w:p>
+    <w:p>
+      <w:pPr>
+        <w:pBdr>
+          <w:top w:color="auto" w:space="0" w:sz="0" w:val="none"/>
+          <w:bottom w:color="auto" w:space="0" w:sz="0" w:val="none"/>
+          <w:right w:color="auto" w:space="0" w:sz="0" w:val="none"/>
+          <w:between w:color="auto" w:space="0" w:sz="0" w:val="none"/>
+        </w:pBdr>
+        <w:spacing w:after="240" w:before="240" w:lineRule="auto"/>
+        <w:rPr>
+          <w:rFonts w:ascii="Times New Roman" w:cs="Times New Roman" w:eastAsia="Times New Roman" w:hAnsi="Times New Roman"/>
+          <w:sz w:val="24"/>
+          <w:szCs w:val="24"/>
+        </w:rPr>
+      </w:pPr>
+      <w:r>
+        <w:rPr>
+          <w:rFonts w:ascii="Times New Roman" w:cs="Times New Roman" w:eastAsia="Times New Roman" w:hAnsi="Times New Roman"/>
+          <w:sz w:val="24"/>
+          <w:szCs w:val="24"/>
+          <w:rtl w:val="0"/>
+        </w:rPr>
+        <w:t xml:space="preserve">Por último es importante la responsabilidad sobre el uso y las consecuencias del sistema. Aunque el proyecto es académico, el prototipo podría migrar a ámbitos sensibles (salud, seguridad, recursos humanos). En tales escenarios, su despliegue sin validación rigurosa y sin supervisión humana podría generar daños. Por lo tanto, el equipo debe establecer límites de uso, advertencias y salvaguardas: el sistema se concibe como apoyo a la toma de decisiones, no como sustituto del criterio profesional; y cualquier transferencia tecnológica futura exigirá nuevas evaluaciones éticas, técnicas y legales.</w:t>
+      </w:r>
+    </w:p>
+    <w:p>
+      <w:pPr>
+        <w:pBdr>
+          <w:top w:color="auto" w:space="0" w:sz="0" w:val="none"/>
+          <w:bottom w:color="auto" w:space="0" w:sz="0" w:val="none"/>
+          <w:right w:color="auto" w:space="0" w:sz="0" w:val="none"/>
+          <w:between w:color="auto" w:space="0" w:sz="0" w:val="none"/>
+        </w:pBdr>
+        <w:spacing w:after="600" w:lineRule="auto"/>
+        <w:ind w:left="0" w:firstLine="0"/>
+        <w:rPr>
+          <w:rFonts w:ascii="Times New Roman" w:cs="Times New Roman" w:eastAsia="Times New Roman" w:hAnsi="Times New Roman"/>
+          <w:b w:val="1"/>
+          <w:sz w:val="24"/>
+          <w:szCs w:val="24"/>
+        </w:rPr>
+      </w:pPr>
+      <w:r>
+        <w:rPr>
+          <w:rtl w:val="0"/>
+        </w:rPr>
+      </w:r>
+    </w:p>
     <w:sectPr>
       <w:pgSz w:h="15840" w:w="12240" w:orient="portrait"/>
       <w:pgMar w:bottom="1388.9763779527561" w:top="1388.9763779527561" w:left="1388.9763779527561" w:right="1388.9763779527561" w:header="720" w:footer="720"/>

</xml_diff>